<commit_message>
docs(informe-4): aclarar que el dataset es propio, recolectado en campos de Danper
</commit_message>
<xml_diff>
--- a/docs/informes/26_05_05_informe_4_unificado.docx
+++ b/docs/informes/26_05_05_informe_4_unificado.docx
@@ -407,7 +407,7 @@
           <w:sz w:val="22"/>
           <w:szCs w:val="22"/>
         </w:rPr>
-        <w:t xml:space="preserve">El desarrollo avanza en dos frentes complementarios. El primero cubre la plataforma de software, que incluye arquitectura, workers, comunicación entre procesos, despliegue y aceleración de inferencia con TensorRT sobre el hardware embebido. El segundo cubre la evaluación de modelos de inteligencia artificial para la detección de frutos, con el entrenamiento y comparación de tres familias de modelos (YoloV9, YoloV10 y YoloV11) sobre un dataset de 800 imágenes de arándanos provenientes del fundo Danper.</w:t>
+        <w:t xml:space="preserve">El desarrollo avanza en dos frentes complementarios. El primero cubre la plataforma de software, que incluye arquitectura, workers, comunicación entre procesos, despliegue y aceleración de inferencia con TensorRT sobre el hardware embebido. El segundo cubre la evaluación de modelos de inteligencia artificial para la detección de frutos, con el entrenamiento y comparación de tres familias de modelos (YoloV9, YoloV10 y YoloV11) sobre un dataset propio de 800 imágenes de arándanos recolectadas en los campos del fundo Danper.</w:t>
       </w:r>
     </w:p>
     <w:p>
@@ -4944,7 +4944,7 @@
           <w:sz w:val="22"/>
           <w:szCs w:val="22"/>
         </w:rPr>
-        <w:t xml:space="preserve">Esta sección resume la evaluación cuantitativa de tres familias de modelos de detección de objetos sobre el dataset de arándanos del fundo Danper. La evaluación detallada de arquitecturas, curvas de entrenamiento y análisis de errores se presenta en el informe técnico #2 (Cubas, 2025). Aquí se reportan los algoritmos evaluados, las métricas empleadas, los resultados por modelo y el estado actual de la integración del modelo de producción.</w:t>
+        <w:t xml:space="preserve">Esta sección resume la evaluación cuantitativa de tres familias de modelos de detección de objetos sobre el dataset propio de arándanos recolectado en los campos del fundo Danper. La evaluación detallada de arquitecturas, curvas de entrenamiento y análisis de errores se presenta en el informe técnico #2 (Cubas, 2025). Aquí se reportan los algoritmos evaluados, las métricas empleadas, los resultados por modelo y el estado actual de la integración del modelo de producción.</w:t>
       </w:r>
     </w:p>
     <w:p>
@@ -6059,7 +6059,7 @@
           <w:sz w:val="22"/>
           <w:szCs w:val="22"/>
         </w:rPr>
-        <w:t xml:space="preserve">El dataset de entrenamiento consta de 800 imágenes no públicas de arándanos del fundo Danper, etiquetadas manualmente con cuadros delimitadores, sobre el cual cada modelo se entrenó variando dos hiperparámetros: backbone (Tiny/Small/Medium/Large/Compact según corresponda al modelo) y número de épocas (50, 100, 150, 200), produciendo entre 16 y 20 configuraciones por familia.</w:t>
+        <w:t xml:space="preserve">El dataset de entrenamiento consta de 800 imágenes no públicas de arándanos, recolectadas por el equipo en los campos del fundo Danper y etiquetadas manualmente con cuadros delimitadores, sobre el cual cada modelo se entrenó variando dos hiperparámetros: backbone (Tiny/Small/Medium/Large/Compact según corresponda al modelo) y número de épocas (50, 100, 150, 200), produciendo entre 16 y 20 configuraciones por familia.</w:t>
       </w:r>
     </w:p>
     <w:p>
@@ -11247,7 +11247,7 @@
           <w:sz w:val="20"/>
           <w:szCs w:val="20"/>
         </w:rPr>
-        <w:t xml:space="preserve">TABLA 11. Resultados del entrenamiento del modelo YoloV9 con 800 imágenes de arándanos del fundo Danper.</w:t>
+        <w:t xml:space="preserve">TABLA 11. Resultados del entrenamiento del modelo YoloV9 con 800 imágenes de arándanos recolectadas en los campos del fundo Danper.</w:t>
       </w:r>
     </w:p>
     <w:p>
@@ -15957,7 +15957,7 @@
           <w:sz w:val="20"/>
           <w:szCs w:val="20"/>
         </w:rPr>
-        <w:t xml:space="preserve">TABLA 12. Resultados del entrenamiento del modelo YoloV10 con 800 imágenes de arándanos del fundo Danper.</w:t>
+        <w:t xml:space="preserve">TABLA 12. Resultados del entrenamiento del modelo YoloV10 con 800 imágenes de arándanos recolectadas en los campos del fundo Danper.</w:t>
       </w:r>
     </w:p>
     <w:p>
@@ -20667,7 +20667,7 @@
           <w:sz w:val="20"/>
           <w:szCs w:val="20"/>
         </w:rPr>
-        <w:t xml:space="preserve">TABLA 13. Resultados del entrenamiento del modelo YoloV11 con 800 imágenes de arándanos del fundo Danper.</w:t>
+        <w:t xml:space="preserve">TABLA 13. Resultados del entrenamiento del modelo YoloV11 con 800 imágenes de arándanos recolectadas en los campos del fundo Danper.</w:t>
       </w:r>
     </w:p>
     <w:p>
@@ -20711,7 +20711,7 @@
           <w:sz w:val="22"/>
           <w:szCs w:val="22"/>
         </w:rPr>
-        <w:t xml:space="preserve">La Tabla 14 reporta el mAP@0.5 máximo de cada familia y la configuración correspondiente sobre el dataset Danper.</w:t>
+        <w:t xml:space="preserve">La Tabla 14 reporta el mAP@0.5 máximo de cada familia y la configuración correspondiente sobre el dataset propio recolectado en Danper.</w:t>
       </w:r>
     </w:p>
     <w:tbl>
@@ -21311,7 +21311,7 @@
           <w:sz w:val="20"/>
           <w:szCs w:val="20"/>
         </w:rPr>
-        <w:t xml:space="preserve">TABLA 14. Mejor configuración por familia de modelos sobre el dataset Danper.</w:t>
+        <w:t xml:space="preserve">TABLA 14. Mejor configuración por familia de modelos sobre el dataset propio recolectado en Danper.</w:t>
       </w:r>
     </w:p>
     <w:p>
@@ -21357,7 +21357,7 @@
           <w:sz w:val="22"/>
           <w:szCs w:val="22"/>
         </w:rPr>
-        <w:t xml:space="preserve">Empaquetar el checkpoint YoloV9-Compact-200 entrenado sobre el dataset Danper en el formato que el inference-worker carga.</w:t>
+        <w:t xml:space="preserve">Empaquetar el checkpoint YoloV9-Compact-200 entrenado sobre el dataset propio recolectado en Danper en el formato que el inference-worker carga.</w:t>
       </w:r>
     </w:p>
     <w:p>
@@ -21482,7 +21482,7 @@
           <w:sz w:val="22"/>
           <w:szCs w:val="22"/>
         </w:rPr>
-        <w:t xml:space="preserve">Los tres modelos evaluados alcanzan mAP@0.5 superiores a 0,83 sobre el dataset Danper. YoloV9-Compact-200 obtiene el máximo (0,8407) y queda seleccionado como el modelo de producción para la detección de frutos. Su integración en la plataforma está en curso e implica empaquetar el checkpoint, componer un wrapper con BoT-SORT y habilitar la conversión a TensorRT FP16 desde el conversion-worker.</w:t>
+        <w:t xml:space="preserve">Los tres modelos evaluados alcanzan mAP@0.5 superiores a 0,83 sobre el dataset propio recolectado en Danper. YoloV9-Compact-200 obtiene el máximo (0,8407) y queda seleccionado como el modelo de producción para la detección de frutos. Su integración en la plataforma está en curso e implica empaquetar el checkpoint, componer un wrapper con BoT-SORT y habilitar la conversión a TensorRT FP16 desde el conversion-worker.</w:t>
       </w:r>
     </w:p>
     <w:p>

</xml_diff>